<commit_message>
Deploy preview for PR 659 🛫
</commit_message>
<xml_diff>
--- a/pr-preview/pr-659/vignettes/articles/version-crosswalk-1.3-to-1.4.docx
+++ b/pr-preview/pr-659/vignettes/articles/version-crosswalk-1.3-to-1.4.docx
@@ -3049,7 +3049,7 @@
         <w:rPr>
           <w:rStyle w:val="CommentTok"/>
         </w:rPr>
-        <w:t xml:space="preserve">#&gt;     age id    antigen_iso   value</w:t>
+        <w:t xml:space="preserve">#&gt;     age id    antigen_iso  value</w:t>
       </w:r>
       <w:r>
         <w:br/>
@@ -3058,7 +3058,7 @@
         <w:rPr>
           <w:rStyle w:val="CommentTok"/>
         </w:rPr>
-        <w:t xml:space="preserve">#&gt;   &lt;dbl&gt; &lt;chr&gt; &lt;chr&gt;         &lt;dbl&gt;</w:t>
+        <w:t xml:space="preserve">#&gt;   &lt;dbl&gt; &lt;chr&gt; &lt;chr&gt;        &lt;dbl&gt;</w:t>
       </w:r>
       <w:r>
         <w:br/>
@@ -3067,7 +3067,7 @@
         <w:rPr>
           <w:rStyle w:val="CommentTok"/>
         </w:rPr>
-        <w:t xml:space="preserve">#&gt; 1  7.19 1     HlyE_IgA      0.614</w:t>
+        <w:t xml:space="preserve">#&gt; 1  8.99 1     HlyE_IgA     0.662</w:t>
       </w:r>
       <w:r>
         <w:br/>
@@ -3076,7 +3076,7 @@
         <w:rPr>
           <w:rStyle w:val="CommentTok"/>
         </w:rPr>
-        <w:t xml:space="preserve">#&gt; 2  7.19 1     HlyE_IgG      0.909</w:t>
+        <w:t xml:space="preserve">#&gt; 2  8.99 1     HlyE_IgG     0.845</w:t>
       </w:r>
       <w:r>
         <w:br/>
@@ -3085,7 +3085,7 @@
         <w:rPr>
           <w:rStyle w:val="CommentTok"/>
         </w:rPr>
-        <w:t xml:space="preserve">#&gt; 3 16.2  2     HlyE_IgA     18.0  </w:t>
+        <w:t xml:space="preserve">#&gt; 3 11.7  2     HlyE_IgA     0.646</w:t>
       </w:r>
       <w:r>
         <w:br/>
@@ -3094,7 +3094,7 @@
         <w:rPr>
           <w:rStyle w:val="CommentTok"/>
         </w:rPr>
-        <w:t xml:space="preserve">#&gt; 4 16.2  2     HlyE_IgG    332.   </w:t>
+        <w:t xml:space="preserve">#&gt; 4 11.7  2     HlyE_IgG     0.216</w:t>
       </w:r>
       <w:r>
         <w:br/>
@@ -3103,7 +3103,7 @@
         <w:rPr>
           <w:rStyle w:val="CommentTok"/>
         </w:rPr>
-        <w:t xml:space="preserve">#&gt; 5  9.05 3     HlyE_IgA      0.680</w:t>
+        <w:t xml:space="preserve">#&gt; 5 11.4  3     HlyE_IgA     0.997</w:t>
       </w:r>
       <w:r>
         <w:br/>
@@ -3112,7 +3112,7 @@
         <w:rPr>
           <w:rStyle w:val="CommentTok"/>
         </w:rPr>
-        <w:t xml:space="preserve">#&gt; 6  9.05 3     HlyE_IgG      0.844</w:t>
+        <w:t xml:space="preserve">#&gt; 6 11.4  3     HlyE_IgG    22.9</w:t>
       </w:r>
       <w:r>
         <w:br/>

</xml_diff>